<commit_message>
Add VCR/VCC and layer-dependent matching to passives; update docs; add validation decks
</commit_message>
<xml_diff>
--- a/docs/AutoHV_BiCMOS180_PDK_Reference.docx
+++ b/docs/AutoHV_BiCMOS180_PDK_Reference.docx
@@ -2113,7 +2113,7 @@
           <w:sz w:val="22"/>
           <w:szCs w:val="22"/>
         </w:rPr>
-        <w:t xml:space="preserve">For a nominal (deterministic) run, leave both at 0. For Monte Carlo, set the relevant switch(es) to 1 and re-run with fresh random draws (Section 7.3). Mismatch scales with size in the expected way: for the MOS and DMOS devices it follows a 1/√(W·M) law, and for the area-based devices (bipolars, diodes, Zeners) it scales as 1/√AREA.</w:t>
+        <w:t xml:space="preserve">For a nominal (deterministic) run, leave both at 0. For Monte Carlo, set the relevant switch(es) to 1 and re-run with fresh random draws (Section 7.3). Mismatch scales with size in the expected way: for the MOS and DMOS devices it follows a 1/√(W·M) law, and for the area-based devices (bipolars, diodes, Zeners) it scales as 1/√AREA. Resistors and capacitors scale as 1/√area, but their per-area mismatch coefficient is now layer-dependent rather than uniform: it grows with sheet resistance for the resistors (RPOLY_LO best, RNWELL worst) and is tighter for MIM than for metal capacitors, so two devices of equal area but different layers will show different spreads.</w:t>
       </w:r>
     </w:p>
     <w:p>
@@ -6565,7 +6565,7 @@
                 <w:sz w:val="20"/>
                 <w:szCs w:val="20"/>
               </w:rPr>
-              <w:t xml:space="preserve">N-well resistor (high value, high TC)</w:t>
+              <w:t xml:space="preserve">N-well resistor (high value; high TC and large VCR)</w:t>
             </w:r>
           </w:p>
         </w:tc>
@@ -6918,6 +6918,19 @@
           <w:szCs w:val="22"/>
         </w:rPr>
         <w:t xml:space="preserve">. Pick the layer for the sheet resistance and matching/TC behavior you need.</w:t>
+      </w:r>
+    </w:p>
+    <w:p>
+      <w:pPr>
+        <w:spacing w:after="120" w:before="0" w:line="276"/>
+      </w:pPr>
+      <w:r>
+        <w:rPr>
+          <w:rFonts w:ascii="Calibri" w:cs="Calibri" w:eastAsia="Calibri" w:hAnsi="Calibri"/>
+          <w:sz w:val="22"/>
+          <w:szCs w:val="22"/>
+        </w:rPr>
+        <w:t xml:space="preserve">The resistor models capture three layer-dependent behaviors. (1) Matching: the per-area mismatch coefficient grows with sheet resistance, so RPOLY_LO matches best, the diffusion layers and RPOLY_HI are progressively worse, and RNWELL is worst — reflecting the documented inverse relationship between resistance and matching coefficient in high-sheet poly. (2) Absolute (die-to-die) tolerance: low-sheet poly is tightest (±12% at 3σ), poly and diffusion are ±18%, and the lightly-doped n-well is widest (±30%). (3) Voltage coefficient (VCR): poly is nearly linear (~50–200 ppm/V), the diffusion layers are moderate (~1500–1800 ppm/V), and RNWELL is strongly nonlinear (~8000 ppm/V) from junction-depletion modulation — large enough to distort a filter or divider that carries signal swing, so the well resistor should be reserved for non-signal nodes. The n-well temperature coefficient was also raised to ~4000 ppm/°C to match published values for diffused/well resistors.</w:t>
       </w:r>
     </w:p>
     <w:p>
@@ -7720,6 +7733,19 @@
     </w:p>
     <w:p>
       <w:pPr>
+        <w:spacing w:after="120" w:before="0" w:line="276"/>
+      </w:pPr>
+      <w:r>
+        <w:rPr>
+          <w:rFonts w:ascii="Calibri" w:cs="Calibri" w:eastAsia="Calibri" w:hAnsi="Calibri"/>
+          <w:sz w:val="22"/>
+          <w:szCs w:val="22"/>
+        </w:rPr>
+        <w:t xml:space="preserve">The capacitor models are also layer-aware. Matching follows the measured MIM-over-metal advantage: CMIM_STD matches best, CMIM_HI is close behind, and the metal caps (CMOM, CFRINGE) are several times looser. Each type carries a voltage coefficient (VCC): the MIM caps show a small bias dependence (~30–60 ppm/V, larger for the thinner-dielectric CMIM_HI), while the oxide-dielectric metal caps are nearly ideal (~3–5 ppm/V). VCC is usually negligible for filters, where the cap sees little DC swing, but it is present for completeness and for switched-cap or charge-redistribution use.</w:t>
+      </w:r>
+    </w:p>
+    <w:p>
+      <w:pPr>
         <w:pStyle w:val="Heading1"/>
       </w:pPr>
       <w:r>
@@ -10335,15 +10361,7 @@
           <w:sz w:val="22"/>
           <w:szCs w:val="22"/>
         </w:rPr>
-        <w:t xml:space="preserve">DMOS drift-length values are placeholders. </w:t>
-      </w:r>
-      <w:r>
-        <w:rPr>
-          <w:rFonts w:ascii="Calibri" w:cs="Calibri" w:eastAsia="Calibri" w:hAnsi="Calibri"/>
-          <w:sz w:val="22"/>
-          <w:szCs w:val="22"/>
-        </w:rPr>
-        <w:t xml:space="preserve">The </w:t>
+        <w:t xml:space="preserve">DMOS drift-length values are placeholders. The </w:t>
       </w:r>
       <w:r>
         <w:rPr>
@@ -10441,15 +10459,7 @@
           <w:sz w:val="22"/>
           <w:szCs w:val="22"/>
         </w:rPr>
-        <w:t xml:space="preserve">Breakdown is held at the model rating. </w:t>
-      </w:r>
-      <w:r>
-        <w:rPr>
-          <w:rFonts w:ascii="Calibri" w:cs="Calibri" w:eastAsia="Calibri" w:hAnsi="Calibri"/>
-          <w:sz w:val="22"/>
-          <w:szCs w:val="22"/>
-        </w:rPr>
-        <w:t xml:space="preserve">Increasing </w:t>
+        <w:t xml:space="preserve">Breakdown is held at the model rating. Increasing </w:t>
       </w:r>
       <w:r>
         <w:rPr>
@@ -10517,15 +10527,7 @@
           <w:sz w:val="22"/>
           <w:szCs w:val="22"/>
         </w:rPr>
-        <w:t xml:space="preserve">Lower-voltage DMOS expose width only. </w:t>
-      </w:r>
-      <w:r>
-        <w:rPr>
-          <w:rFonts w:ascii="Calibri" w:cs="Calibri" w:eastAsia="Calibri" w:hAnsi="Calibri"/>
-          <w:sz w:val="22"/>
-          <w:szCs w:val="22"/>
-        </w:rPr>
-        <w:t xml:space="preserve">Their channel and drift lengths are fixed at the process minimum, which is the normal behavior for binned voltage classes; only the top-of-range 200 V device gives a useful, characterized length window.</w:t>
+        <w:t>Lower-voltage DMOS expose width only. Their channel and drift lengths are fixed at the process minimum, which is the normal behavior for binned voltage classes; only the top-of-range 200 V device gives a useful, characterized length window.</w:t>
       </w:r>
     </w:p>
     <w:p>
@@ -10543,111 +10545,7 @@
           <w:sz w:val="22"/>
           <w:szCs w:val="22"/>
         </w:rPr>
-        <w:t xml:space="preserve">Parameter rename. </w:t>
-      </w:r>
-      <w:r>
-        <w:rPr>
-          <w:rFonts w:ascii="Calibri" w:cs="Calibri" w:eastAsia="Calibri" w:hAnsi="Calibri"/>
-          <w:sz w:val="22"/>
-          <w:szCs w:val="22"/>
-        </w:rPr>
-        <w:t xml:space="preserve">DMOS devices now size by </w:t>
-      </w:r>
-      <w:r>
-        <w:rPr>
-          <w:rFonts w:ascii="Consolas" w:cs="Consolas" w:eastAsia="Consolas" w:hAnsi="Consolas"/>
-          <w:sz w:val="20"/>
-          <w:szCs w:val="20"/>
-        </w:rPr>
-        <w:t xml:space="preserve">W</w:t>
-      </w:r>
-      <w:r>
-        <w:rPr>
-          <w:rFonts w:ascii="Calibri" w:cs="Calibri" w:eastAsia="Calibri" w:hAnsi="Calibri"/>
-          <w:sz w:val="22"/>
-          <w:szCs w:val="22"/>
-        </w:rPr>
-        <w:t xml:space="preserve"> / </w:t>
-      </w:r>
-      <w:r>
-        <w:rPr>
-          <w:rFonts w:ascii="Consolas" w:cs="Consolas" w:eastAsia="Consolas" w:hAnsi="Consolas"/>
-          <w:sz w:val="20"/>
-          <w:szCs w:val="20"/>
-        </w:rPr>
-        <w:t xml:space="preserve">L</w:t>
-      </w:r>
-      <w:r>
-        <w:rPr>
-          <w:rFonts w:ascii="Calibri" w:cs="Calibri" w:eastAsia="Calibri" w:hAnsi="Calibri"/>
-          <w:sz w:val="22"/>
-          <w:szCs w:val="22"/>
-        </w:rPr>
-        <w:t xml:space="preserve"> / </w:t>
-      </w:r>
-      <w:r>
-        <w:rPr>
-          <w:rFonts w:ascii="Consolas" w:cs="Consolas" w:eastAsia="Consolas" w:hAnsi="Consolas"/>
-          <w:sz w:val="20"/>
-          <w:szCs w:val="20"/>
-        </w:rPr>
-        <w:t xml:space="preserve">M</w:t>
-      </w:r>
-      <w:r>
-        <w:rPr>
-          <w:rFonts w:ascii="Calibri" w:cs="Calibri" w:eastAsia="Calibri" w:hAnsi="Calibri"/>
-          <w:sz w:val="22"/>
-          <w:szCs w:val="22"/>
-        </w:rPr>
-        <w:t xml:space="preserve"> rather than the former </w:t>
-      </w:r>
-      <w:r>
-        <w:rPr>
-          <w:rFonts w:ascii="Consolas" w:cs="Consolas" w:eastAsia="Consolas" w:hAnsi="Consolas"/>
-          <w:sz w:val="20"/>
-          <w:szCs w:val="20"/>
-        </w:rPr>
-        <w:t xml:space="preserve">AREA</w:t>
-      </w:r>
-      <w:r>
-        <w:rPr>
-          <w:rFonts w:ascii="Calibri" w:cs="Calibri" w:eastAsia="Calibri" w:hAnsi="Calibri"/>
-          <w:sz w:val="22"/>
-          <w:szCs w:val="22"/>
-        </w:rPr>
-        <w:t xml:space="preserve">. Re-place or update any DMOS instances that still carry </w:t>
-      </w:r>
-      <w:r>
-        <w:rPr>
-          <w:rFonts w:ascii="Consolas" w:cs="Consolas" w:eastAsia="Consolas" w:hAnsi="Consolas"/>
-          <w:sz w:val="20"/>
-          <w:szCs w:val="20"/>
-        </w:rPr>
-        <w:t xml:space="preserve">AREA</w:t>
-      </w:r>
-      <w:r>
-        <w:rPr>
-          <w:rFonts w:ascii="Calibri" w:cs="Calibri" w:eastAsia="Calibri" w:hAnsi="Calibri"/>
-          <w:sz w:val="22"/>
-          <w:szCs w:val="22"/>
-        </w:rPr>
-        <w:t xml:space="preserve">. Bipolars, diodes, and Zeners legitimately keep </w:t>
-      </w:r>
-      <w:r>
-        <w:rPr>
-          <w:rFonts w:ascii="Consolas" w:cs="Consolas" w:eastAsia="Consolas" w:hAnsi="Consolas"/>
-          <w:sz w:val="20"/>
-          <w:szCs w:val="20"/>
-        </w:rPr>
-        <w:t xml:space="preserve">AREA</w:t>
-      </w:r>
-      <w:r>
-        <w:rPr>
-          <w:rFonts w:ascii="Calibri" w:cs="Calibri" w:eastAsia="Calibri" w:hAnsi="Calibri"/>
-          <w:sz w:val="22"/>
-          <w:szCs w:val="22"/>
-        </w:rPr>
-        <w:t xml:space="preserve">.</w:t>
+        <w:t xml:space="preserve">Passive voltage/temperature coefficients are literature-anchored, not silicon-extracted. The resistor VCR values (poly ~50–200 ppm/V, diffusion ~1500–1800 ppm/V, n-well ~8000 ppm/V), the capacitor VCC values, the layer-dependent matching coefficients, and the raised n-well TCR (~4000 ppm/°C) are physically plausible defaults drawn from published data, not measured on this process. They live as named .param lines (VCR1/VCR2, VCC1/VCC2, RSH0/CJ0, and the per-layer mismatch and P_DRSH coefficients) inside each device subckt so you can recalibrate them in one place against real silicon.</w:t>
       </w:r>
     </w:p>
     <w:p>
@@ -10665,23 +10563,7 @@
           <w:sz w:val="22"/>
           <w:szCs w:val="22"/>
         </w:rPr>
-        <w:t xml:space="preserve">One corner per run. </w:t>
-      </w:r>
-      <w:r>
-        <w:rPr>
-          <w:rFonts w:ascii="Consolas" w:cs="Consolas" w:eastAsia="Consolas" w:hAnsi="Consolas"/>
-          <w:sz w:val="20"/>
-          <w:szCs w:val="20"/>
-        </w:rPr>
-        <w:t xml:space="preserve">case</w:t>
-      </w:r>
-      <w:r>
-        <w:rPr>
-          <w:rFonts w:ascii="Calibri" w:cs="Calibri" w:eastAsia="Calibri" w:hAnsi="Calibri"/>
-          <w:sz w:val="22"/>
-          <w:szCs w:val="22"/>
-        </w:rPr>
-        <w:t xml:space="preserve"> is global, so a single simulation evaluates one corner. Sweep it across runs for corner analysis.</w:t>
+        <w:t xml:space="preserve">Resistor VCR uses the two-terminal voltage as a proxy for the true junction bias. The well and diffusion resistors expose only p and n terminals (no separate well/substrate tap), so their voltage coefficient is keyed to the magnitude of the terminal voltage rather than the actual depletion bias against the isolation. This captures the first-order nonlinearity but is not a substitute for a proper three-terminal well-resistor model if you need accurate large-signal behavior.</w:t>
       </w:r>
     </w:p>
     <w:p>
@@ -10699,7 +10581,25 @@
           <w:sz w:val="22"/>
           <w:szCs w:val="22"/>
         </w:rPr>
-        <w:t xml:space="preserve">Use plain </w:t>
+        <w:t xml:space="preserve">Voltage coefficients are implemented behaviorally and preserve the existing models. VCR is a node-voltage-controlled source in series with the model-card resistor, so the resistor’s temperature, corner, mismatch, and flicker-noise behavior are untouched; VCC is a behavioral capacitor in parallel with the model-card capacitor. Both use node voltages only (for portability across ngspice and SmartSpice) and vanish at zero bias, so nominal values are unchanged. Two decks — autohv_passive_validation.cir and autohv_mismatch_mc.cir — exercise nominal value, TCR, VCR, VCC, corner spread, and layer-dependent mismatch.</w:t>
+      </w:r>
+    </w:p>
+    <w:p>
+      <w:pPr>
+        <w:pStyle w:val="ListParagraph"/>
+        <w:numPr>
+          <w:ilvl w:val="0"/>
+          <w:numId w:val="2"/>
+        </w:numPr>
+        <w:spacing w:after="80" w:line="276"/>
+      </w:pPr>
+      <w:r>
+        <w:rPr>
+          <w:rFonts w:ascii="Calibri" w:cs="Calibri" w:eastAsia="Calibri" w:hAnsi="Calibri"/>
+          <w:sz w:val="22"/>
+          <w:szCs w:val="22"/>
+        </w:rPr>
+        <w:t xml:space="preserve">Parameter rename. DMOS devices now size by </w:t>
       </w:r>
       <w:r>
         <w:rPr>
@@ -10707,6 +10607,154 @@
           <w:sz w:val="20"/>
           <w:szCs w:val="20"/>
         </w:rPr>
+        <w:t xml:space="preserve">W</w:t>
+      </w:r>
+      <w:r>
+        <w:rPr>
+          <w:rFonts w:ascii="Calibri" w:cs="Calibri" w:eastAsia="Calibri" w:hAnsi="Calibri"/>
+          <w:sz w:val="22"/>
+          <w:szCs w:val="22"/>
+        </w:rPr>
+        <w:t xml:space="preserve"> / </w:t>
+      </w:r>
+      <w:r>
+        <w:rPr>
+          <w:rFonts w:ascii="Consolas" w:cs="Consolas" w:eastAsia="Consolas" w:hAnsi="Consolas"/>
+          <w:sz w:val="20"/>
+          <w:szCs w:val="20"/>
+        </w:rPr>
+        <w:t xml:space="preserve">L</w:t>
+      </w:r>
+      <w:r>
+        <w:rPr>
+          <w:rFonts w:ascii="Calibri" w:cs="Calibri" w:eastAsia="Calibri" w:hAnsi="Calibri"/>
+          <w:sz w:val="22"/>
+          <w:szCs w:val="22"/>
+        </w:rPr>
+        <w:t xml:space="preserve"> / </w:t>
+      </w:r>
+      <w:r>
+        <w:rPr>
+          <w:rFonts w:ascii="Consolas" w:cs="Consolas" w:eastAsia="Consolas" w:hAnsi="Consolas"/>
+          <w:sz w:val="20"/>
+          <w:szCs w:val="20"/>
+        </w:rPr>
+        <w:t xml:space="preserve">M</w:t>
+      </w:r>
+      <w:r>
+        <w:rPr>
+          <w:rFonts w:ascii="Calibri" w:cs="Calibri" w:eastAsia="Calibri" w:hAnsi="Calibri"/>
+          <w:sz w:val="22"/>
+          <w:szCs w:val="22"/>
+        </w:rPr>
+        <w:t xml:space="preserve"> rather than the former </w:t>
+      </w:r>
+      <w:r>
+        <w:rPr>
+          <w:rFonts w:ascii="Consolas" w:cs="Consolas" w:eastAsia="Consolas" w:hAnsi="Consolas"/>
+          <w:sz w:val="20"/>
+          <w:szCs w:val="20"/>
+        </w:rPr>
+        <w:t xml:space="preserve">AREA</w:t>
+      </w:r>
+      <w:r>
+        <w:rPr>
+          <w:rFonts w:ascii="Calibri" w:cs="Calibri" w:eastAsia="Calibri" w:hAnsi="Calibri"/>
+          <w:sz w:val="22"/>
+          <w:szCs w:val="22"/>
+        </w:rPr>
+        <w:t xml:space="preserve">. Re-place or update any DMOS instances that still carry </w:t>
+      </w:r>
+      <w:r>
+        <w:rPr>
+          <w:rFonts w:ascii="Consolas" w:cs="Consolas" w:eastAsia="Consolas" w:hAnsi="Consolas"/>
+          <w:sz w:val="20"/>
+          <w:szCs w:val="20"/>
+        </w:rPr>
+        <w:t xml:space="preserve">AREA</w:t>
+      </w:r>
+      <w:r>
+        <w:rPr>
+          <w:rFonts w:ascii="Calibri" w:cs="Calibri" w:eastAsia="Calibri" w:hAnsi="Calibri"/>
+          <w:sz w:val="22"/>
+          <w:szCs w:val="22"/>
+        </w:rPr>
+        <w:t xml:space="preserve">. Bipolars, diodes, and Zeners legitimately keep </w:t>
+      </w:r>
+      <w:r>
+        <w:rPr>
+          <w:rFonts w:ascii="Consolas" w:cs="Consolas" w:eastAsia="Consolas" w:hAnsi="Consolas"/>
+          <w:sz w:val="20"/>
+          <w:szCs w:val="20"/>
+        </w:rPr>
+        <w:t xml:space="preserve">AREA</w:t>
+      </w:r>
+      <w:r>
+        <w:rPr>
+          <w:rFonts w:ascii="Calibri" w:cs="Calibri" w:eastAsia="Calibri" w:hAnsi="Calibri"/>
+          <w:sz w:val="22"/>
+          <w:szCs w:val="22"/>
+        </w:rPr>
+        <w:t xml:space="preserve">.</w:t>
+      </w:r>
+    </w:p>
+    <w:p>
+      <w:pPr>
+        <w:pStyle w:val="ListParagraph"/>
+        <w:numPr>
+          <w:ilvl w:val="0"/>
+          <w:numId w:val="2"/>
+        </w:numPr>
+        <w:spacing w:after="80" w:line="276"/>
+      </w:pPr>
+      <w:r>
+        <w:rPr>
+          <w:rFonts w:ascii="Calibri" w:cs="Calibri" w:eastAsia="Calibri" w:hAnsi="Calibri"/>
+          <w:sz w:val="22"/>
+          <w:szCs w:val="22"/>
+        </w:rPr>
+        <w:t xml:space="preserve">One corner per run. </w:t>
+      </w:r>
+      <w:r>
+        <w:rPr>
+          <w:rFonts w:ascii="Consolas" w:cs="Consolas" w:eastAsia="Consolas" w:hAnsi="Consolas"/>
+          <w:sz w:val="20"/>
+          <w:szCs w:val="20"/>
+        </w:rPr>
+        <w:t xml:space="preserve">case</w:t>
+      </w:r>
+      <w:r>
+        <w:rPr>
+          <w:rFonts w:ascii="Calibri" w:cs="Calibri" w:eastAsia="Calibri" w:hAnsi="Calibri"/>
+          <w:sz w:val="22"/>
+          <w:szCs w:val="22"/>
+        </w:rPr>
+        <w:t xml:space="preserve"> is global, so a single simulation evaluates one corner. Sweep it across runs for corner analysis.</w:t>
+      </w:r>
+    </w:p>
+    <w:p>
+      <w:pPr>
+        <w:pStyle w:val="ListParagraph"/>
+        <w:numPr>
+          <w:ilvl w:val="0"/>
+          <w:numId w:val="2"/>
+        </w:numPr>
+        <w:spacing w:after="80" w:line="276"/>
+      </w:pPr>
+      <w:r>
+        <w:rPr>
+          <w:rFonts w:ascii="Calibri" w:cs="Calibri" w:eastAsia="Calibri" w:hAnsi="Calibri"/>
+          <w:sz w:val="22"/>
+          <w:szCs w:val="22"/>
+        </w:rPr>
+        <w:t xml:space="preserve">Use plain </w:t>
+      </w:r>
+      <w:r>
+        <w:rPr>
+          <w:rFonts w:ascii="Consolas" w:cs="Consolas" w:eastAsia="Consolas" w:hAnsi="Consolas"/>
+          <w:sz w:val="20"/>
+          <w:szCs w:val="20"/>
+        </w:rPr>
         <w:t xml:space="preserve">.include</w:t>
       </w:r>
       <w:r>
@@ -10715,15 +10763,7 @@
           <w:sz w:val="22"/>
           <w:szCs w:val="22"/>
         </w:rPr>
-        <w:t xml:space="preserve">. </w:t>
-      </w:r>
-      <w:r>
-        <w:rPr>
-          <w:rFonts w:ascii="Calibri" w:cs="Calibri" w:eastAsia="Calibri" w:hAnsi="Calibri"/>
-          <w:sz w:val="22"/>
-          <w:szCs w:val="22"/>
-        </w:rPr>
-        <w:t xml:space="preserve">The library is a flat set with no </w:t>
+        <w:t xml:space="preserve">. The library is a flat set with no </w:t>
       </w:r>
       <w:r>
         <w:rPr>

</xml_diff>